<commit_message>
PyInstaller-Build für die Engine (Fehler beim Lauf der installierten Datei)
</commit_message>
<xml_diff>
--- a/docs/PaperTrailCompare_Architekturspezifikation.docx
+++ b/docs/PaperTrailCompare_Architekturspezifikation.docx
@@ -40,7 +40,15 @@
           <w:sz w:val="22"/>
           <w:szCs w:val="22"/>
         </w:rPr>
-        <w:t xml:space="preserve">Version 1.1  ·  Juli 2026</w:t>
+        <w:t>Version 1.2  ·  Juli 2026</w:t>
+      </w:r>
+    </w:p>
+    <w:p>
+      <w:r>
+        <w:rPr>
+          <w:b/>
+        </w:rPr>
+        <w:t>Änderungshinweis (v1.2): Abschnitt 4 (Technologie-Stack) und Architekturentscheidung #2 (Abschnitt 6.2) korrigiert: Die ursprüngliche Schätzung von ~50 MB für die eingebettete Python-Runtime war zu niedrig. Ein realer PyInstaller-Build (macOS, aarch64) der Engine inkl. PyMuPDF, Tesseract und deu-Sprachmodell ergibt ~60 MB für den Sidecar allein, ~73 MB für die vollständig installierte App inkl. Tauri-Shell. Grund: PyMuPDFs native Bibliothek (libmupdf) bringt bereits ~45 MB mit, das war in der ursprünglichen Schätzung nicht berücksichtigt. Zur Einordnung: Electron benötigt allein für die GUI-Shell (ohne jede Python-Engine) bereits ~150 MB (siehe Abschnitt 6.1) - die Gesamtgröße von PaperTrail Compare bleibt trotz eingebettetem Python-Interpreter deutlich darunter.</w:t>
       </w:r>
     </w:p>
     <w:p>
@@ -2556,6 +2564,14 @@
       </w:r>
       <w:r>
         <w:t xml:space="preserve">WebView2 ist auf Windows 11 vorinstalliert; Windows 10 erhält es automatisch per Windows Update. Kein manueller Schritt beim Kunden erforderlich.</w:t>
+      </w:r>
+    </w:p>
+    <w:p>
+      <w:r>
+        <w:rPr>
+          <w:b/>
+        </w:rPr>
+        <w:t>💡 Hinweis (v1.2): ~10 MB gilt für die reine Tauri-Shell ohne die gebündelte Python-Engine. Mit eingebettetem PyInstaller-Sidecar (PyMuPDF, Tesseract, deu-Sprachmodell) liegt die vollständig installierte App bei ~73 MB (gemessen, siehe Änderungshinweis v1.2 oben) - Electron benötigt bereits für die reine GUI-Shell (ohne jede Python-Engine) ~150 MB. Der Größenvorteil von Tauri bleibt also auch mit gebündelter Engine erhalten, fällt aber geringer aus als der reine Shell-Vergleich suggeriert.</w:t>
       </w:r>
     </w:p>
     <w:p>
@@ -2961,10 +2977,9 @@
           <w:p>
             <w:r>
               <w:rPr>
-                <w:b w:val="false"/>
-                <w:bCs w:val="false"/>
-              </w:rPr>
-              <w:t xml:space="preserve">Python-Runtime wird in die .exe/.app eingebettet (~50 MB); kein separater Python-Installer beim Kunden nötig</w:t>
+                <w:b w:val="0"/>
+              </w:rPr>
+              <w:t>Python-Runtime wird in die .exe/.app eingebettet (~60 MB für den Sidecar allein, gemessen an einem realen macOS-Build inkl. PyMuPDF/Tesseract/deu-Sprachmodell; ursprüngliche Schätzung von ~50 MB war zu niedrig, siehe Änderungshinweis v1.2); kein separater Python-Installer beim Kunden nötig</w:t>
             </w:r>
           </w:p>
         </w:tc>

</xml_diff>